<commit_message>
RESTCONF complete , DOCS updated
</commit_message>
<xml_diff>
--- a/XCO_MCP_Server_User_Guide.docx
+++ b/XCO_MCP_Server_User_Guide.docx
@@ -1127,6 +1127,523 @@
         <w:t>| jq '.result.payload.tier1_raw | keys'</w:t>
       </w:r>
     </w:p>
+    <w:p>
+      <w:r>
+        <w:br w:type="page"/>
+      </w:r>
+    </w:p>
+    <w:p>
+      <w:pPr>
+        <w:pStyle w:val="Heading1"/>
+      </w:pPr>
+      <w:r>
+        <w:t>RESTCONF Toolpack</w:t>
+      </w:r>
+    </w:p>
+    <w:p>
+      <w:r>
+        <w:t xml:space="preserve">This section documents the RESTCONF-focused Tier‑2 tools added for SLX switches. </w:t>
+      </w:r>
+      <w:r>
+        <w:t>All tools are SAFE_READ and require a target switch management IP/FQDN via the `switch_ip` input.</w:t>
+      </w:r>
+    </w:p>
+    <w:p>
+      <w:r>
+        <w:t>Common optional inputs: `include_raw`, and credential overrides (`username`, `password`, `verify_tls`, `timeout_seconds`).</w:t>
+      </w:r>
+    </w:p>
+    <w:tbl>
+      <w:tblPr>
+        <w:tblW w:type="auto" w:w="0"/>
+        <w:tblLook w:firstColumn="1" w:firstRow="1" w:lastColumn="0" w:lastRow="0" w:noHBand="0" w:noVBand="1" w:val="04A0"/>
+      </w:tblPr>
+      <w:tblGrid>
+        <w:gridCol w:w="2880"/>
+        <w:gridCol w:w="2880"/>
+        <w:gridCol w:w="2880"/>
+      </w:tblGrid>
+      <w:tr>
+        <w:tc>
+          <w:tcPr>
+            <w:tcW w:type="dxa" w:w="2880"/>
+          </w:tcPr>
+          <w:p>
+            <w:r>
+              <w:t>Tool</w:t>
+            </w:r>
+          </w:p>
+        </w:tc>
+        <w:tc>
+          <w:tcPr>
+            <w:tcW w:type="dxa" w:w="2880"/>
+          </w:tcPr>
+          <w:p>
+            <w:r>
+              <w:t>Description</w:t>
+            </w:r>
+          </w:p>
+        </w:tc>
+        <w:tc>
+          <w:tcPr>
+            <w:tcW w:type="dxa" w:w="2880"/>
+          </w:tcPr>
+          <w:p>
+            <w:r>
+              <w:t>Example use case (AI/UI)</w:t>
+            </w:r>
+          </w:p>
+        </w:tc>
+      </w:tr>
+      <w:tr>
+        <w:tc>
+          <w:tcPr>
+            <w:tcW w:type="dxa" w:w="2880"/>
+          </w:tcPr>
+          <w:p>
+            <w:r>
+              <w:t>restconf_show_firmware_version</w:t>
+            </w:r>
+          </w:p>
+        </w:tc>
+        <w:tc>
+          <w:tcPr>
+            <w:tcW w:type="dxa" w:w="2880"/>
+          </w:tcPr>
+          <w:p>
+            <w:r>
+              <w:t>Query SLX switch via RESTCONF to retrieve OS version, firmware build, uptime, CPU and memory info.</w:t>
+            </w:r>
+          </w:p>
+        </w:tc>
+        <w:tc>
+          <w:tcPr>
+            <w:tcW w:type="dxa" w:w="2880"/>
+          </w:tcPr>
+          <w:p>
+            <w:r>
+              <w:t>AI: 'What firmware version is running on switch 10.13.9.66?'</w:t>
+            </w:r>
+          </w:p>
+        </w:tc>
+      </w:tr>
+      <w:tr>
+        <w:tc>
+          <w:tcPr>
+            <w:tcW w:type="dxa" w:w="2880"/>
+          </w:tcPr>
+          <w:p>
+            <w:r>
+              <w:t>restconf_get_interface_detail</w:t>
+            </w:r>
+          </w:p>
+        </w:tc>
+        <w:tc>
+          <w:tcPr>
+            <w:tcW w:type="dxa" w:w="2880"/>
+          </w:tcPr>
+          <w:p>
+            <w:r>
+              <w:t>Retrieve detailed interface information including status and counters from the switch.</w:t>
+            </w:r>
+          </w:p>
+        </w:tc>
+        <w:tc>
+          <w:tcPr>
+            <w:tcW w:type="dxa" w:w="2880"/>
+          </w:tcPr>
+          <w:p>
+            <w:r>
+              <w:t>UI: Drill into a specific interface to view operational state and statistics.</w:t>
+            </w:r>
+          </w:p>
+        </w:tc>
+      </w:tr>
+      <w:tr>
+        <w:tc>
+          <w:tcPr>
+            <w:tcW w:type="dxa" w:w="2880"/>
+          </w:tcPr>
+          <w:p>
+            <w:r>
+              <w:t>restconf_list_operations</w:t>
+            </w:r>
+          </w:p>
+        </w:tc>
+        <w:tc>
+          <w:tcPr>
+            <w:tcW w:type="dxa" w:w="2880"/>
+          </w:tcPr>
+          <w:p>
+            <w:r>
+              <w:t>List all RESTCONF RPC operations supported by the switch.</w:t>
+            </w:r>
+          </w:p>
+        </w:tc>
+        <w:tc>
+          <w:tcPr>
+            <w:tcW w:type="dxa" w:w="2880"/>
+          </w:tcPr>
+          <w:p>
+            <w:r>
+              <w:t>AI: 'What RESTCONF operations does this switch support?'</w:t>
+            </w:r>
+          </w:p>
+        </w:tc>
+      </w:tr>
+      <w:tr>
+        <w:tc>
+          <w:tcPr>
+            <w:tcW w:type="dxa" w:w="2880"/>
+          </w:tcPr>
+          <w:p>
+            <w:r>
+              <w:t>restconf_get_lldp_neighbor_detail</w:t>
+            </w:r>
+          </w:p>
+        </w:tc>
+        <w:tc>
+          <w:tcPr>
+            <w:tcW w:type="dxa" w:w="2880"/>
+          </w:tcPr>
+          <w:p>
+            <w:r>
+              <w:t>Retrieve LLDP neighbor details to understand connected devices.</w:t>
+            </w:r>
+          </w:p>
+        </w:tc>
+        <w:tc>
+          <w:tcPr>
+            <w:tcW w:type="dxa" w:w="2880"/>
+          </w:tcPr>
+          <w:p>
+            <w:r>
+              <w:t>AI: 'Show LLDP neighbors for switch 10.13.9.66.'</w:t>
+            </w:r>
+          </w:p>
+        </w:tc>
+      </w:tr>
+      <w:tr>
+        <w:tc>
+          <w:tcPr>
+            <w:tcW w:type="dxa" w:w="2880"/>
+          </w:tcPr>
+          <w:p>
+            <w:r>
+              <w:t>restconf_get_port_statistics_summary</w:t>
+            </w:r>
+          </w:p>
+        </w:tc>
+        <w:tc>
+          <w:tcPr>
+            <w:tcW w:type="dxa" w:w="2880"/>
+          </w:tcPr>
+          <w:p>
+            <w:r>
+              <w:t>Summarize port traffic statistics and errors across interfaces.</w:t>
+            </w:r>
+          </w:p>
+        </w:tc>
+        <w:tc>
+          <w:tcPr>
+            <w:tcW w:type="dxa" w:w="2880"/>
+          </w:tcPr>
+          <w:p>
+            <w:r>
+              <w:t>UI: Display top ports by traffic or error counters.</w:t>
+            </w:r>
+          </w:p>
+        </w:tc>
+      </w:tr>
+      <w:tr>
+        <w:tc>
+          <w:tcPr>
+            <w:tcW w:type="dxa" w:w="2880"/>
+          </w:tcPr>
+          <w:p>
+            <w:r>
+              <w:t>restconf_get_media_detail</w:t>
+            </w:r>
+          </w:p>
+        </w:tc>
+        <w:tc>
+          <w:tcPr>
+            <w:tcW w:type="dxa" w:w="2880"/>
+          </w:tcPr>
+          <w:p>
+            <w:r>
+              <w:t>Retrieve physical media/transceiver details for switch ports.</w:t>
+            </w:r>
+          </w:p>
+        </w:tc>
+        <w:tc>
+          <w:tcPr>
+            <w:tcW w:type="dxa" w:w="2880"/>
+          </w:tcPr>
+          <w:p>
+            <w:r>
+              <w:t>AI: 'Show optics details for Ethernet 0/1.'</w:t>
+            </w:r>
+          </w:p>
+        </w:tc>
+      </w:tr>
+      <w:tr>
+        <w:tc>
+          <w:tcPr>
+            <w:tcW w:type="dxa" w:w="2880"/>
+          </w:tcPr>
+          <w:p>
+            <w:r>
+              <w:t>restconf_get_arp_table</w:t>
+            </w:r>
+          </w:p>
+        </w:tc>
+        <w:tc>
+          <w:tcPr>
+            <w:tcW w:type="dxa" w:w="2880"/>
+          </w:tcPr>
+          <w:p>
+            <w:r>
+              <w:t>Retrieve the ARP table entries from the switch.</w:t>
+            </w:r>
+          </w:p>
+        </w:tc>
+        <w:tc>
+          <w:tcPr>
+            <w:tcW w:type="dxa" w:w="2880"/>
+          </w:tcPr>
+          <w:p>
+            <w:r>
+              <w:t>AI: 'List ARP entries on the switch.'</w:t>
+            </w:r>
+          </w:p>
+        </w:tc>
+      </w:tr>
+      <w:tr>
+        <w:tc>
+          <w:tcPr>
+            <w:tcW w:type="dxa" w:w="2880"/>
+          </w:tcPr>
+          <w:p>
+            <w:r>
+              <w:t>restconf_get_clock</w:t>
+            </w:r>
+          </w:p>
+        </w:tc>
+        <w:tc>
+          <w:tcPr>
+            <w:tcW w:type="dxa" w:w="2880"/>
+          </w:tcPr>
+          <w:p>
+            <w:r>
+              <w:t>Retrieve system clock/time information from the switch.</w:t>
+            </w:r>
+          </w:p>
+        </w:tc>
+        <w:tc>
+          <w:tcPr>
+            <w:tcW w:type="dxa" w:w="2880"/>
+          </w:tcPr>
+          <w:p>
+            <w:r>
+              <w:t>UI: Display current device time for troubleshooting.</w:t>
+            </w:r>
+          </w:p>
+        </w:tc>
+      </w:tr>
+      <w:tr>
+        <w:tc>
+          <w:tcPr>
+            <w:tcW w:type="dxa" w:w="2880"/>
+          </w:tcPr>
+          <w:p>
+            <w:r>
+              <w:t>restconf_get_vlan_brief</w:t>
+            </w:r>
+          </w:p>
+        </w:tc>
+        <w:tc>
+          <w:tcPr>
+            <w:tcW w:type="dxa" w:w="2880"/>
+          </w:tcPr>
+          <w:p>
+            <w:r>
+              <w:t>Retrieve VLAN summary information configured on the switch.</w:t>
+            </w:r>
+          </w:p>
+        </w:tc>
+        <w:tc>
+          <w:tcPr>
+            <w:tcW w:type="dxa" w:w="2880"/>
+          </w:tcPr>
+          <w:p>
+            <w:r>
+              <w:t>AI: 'Show VLAN summary on this switch.'</w:t>
+            </w:r>
+          </w:p>
+        </w:tc>
+      </w:tr>
+      <w:tr>
+        <w:tc>
+          <w:tcPr>
+            <w:tcW w:type="dxa" w:w="2880"/>
+          </w:tcPr>
+          <w:p>
+            <w:r>
+              <w:t>restconf_get_vrf_summary</w:t>
+            </w:r>
+          </w:p>
+        </w:tc>
+        <w:tc>
+          <w:tcPr>
+            <w:tcW w:type="dxa" w:w="2880"/>
+          </w:tcPr>
+          <w:p>
+            <w:r>
+              <w:t>Retrieve VRF configuration and summary information.</w:t>
+            </w:r>
+          </w:p>
+        </w:tc>
+        <w:tc>
+          <w:tcPr>
+            <w:tcW w:type="dxa" w:w="2880"/>
+          </w:tcPr>
+          <w:p>
+            <w:r>
+              <w:t>AI: 'List all VRFs configured on the switch.'</w:t>
+            </w:r>
+          </w:p>
+        </w:tc>
+      </w:tr>
+      <w:tr>
+        <w:tc>
+          <w:tcPr>
+            <w:tcW w:type="dxa" w:w="2880"/>
+          </w:tcPr>
+          <w:p>
+            <w:r>
+              <w:t>restconf_get_ip_interface</w:t>
+            </w:r>
+          </w:p>
+        </w:tc>
+        <w:tc>
+          <w:tcPr>
+            <w:tcW w:type="dxa" w:w="2880"/>
+          </w:tcPr>
+          <w:p>
+            <w:r>
+              <w:t>Retrieve IP interface configuration and status details.</w:t>
+            </w:r>
+          </w:p>
+        </w:tc>
+        <w:tc>
+          <w:tcPr>
+            <w:tcW w:type="dxa" w:w="2880"/>
+          </w:tcPr>
+          <w:p>
+            <w:r>
+              <w:t>UI: Show all IP interfaces with their state and addresses.</w:t>
+            </w:r>
+          </w:p>
+        </w:tc>
+      </w:tr>
+      <w:tr>
+        <w:tc>
+          <w:tcPr>
+            <w:tcW w:type="dxa" w:w="2880"/>
+          </w:tcPr>
+          <w:p>
+            <w:r>
+              <w:t>restconf_get_running_config</w:t>
+            </w:r>
+          </w:p>
+        </w:tc>
+        <w:tc>
+          <w:tcPr>
+            <w:tcW w:type="dxa" w:w="2880"/>
+          </w:tcPr>
+          <w:p>
+            <w:r>
+              <w:t>Retrieve running configuration directly from the switch via RESTCONF.</w:t>
+            </w:r>
+          </w:p>
+        </w:tc>
+        <w:tc>
+          <w:tcPr>
+            <w:tcW w:type="dxa" w:w="2880"/>
+          </w:tcPr>
+          <w:p>
+            <w:r>
+              <w:t>AI: 'Fetch running configuration for backup review.'</w:t>
+            </w:r>
+          </w:p>
+        </w:tc>
+      </w:tr>
+      <w:tr>
+        <w:tc>
+          <w:tcPr>
+            <w:tcW w:type="dxa" w:w="2880"/>
+          </w:tcPr>
+          <w:p>
+            <w:r>
+              <w:t>restconf_get_system_maintenance_status</w:t>
+            </w:r>
+          </w:p>
+        </w:tc>
+        <w:tc>
+          <w:tcPr>
+            <w:tcW w:type="dxa" w:w="2880"/>
+          </w:tcPr>
+          <w:p>
+            <w:r>
+              <w:t>Retrieve system maintenance mode status and stage information.</w:t>
+            </w:r>
+          </w:p>
+        </w:tc>
+        <w:tc>
+          <w:tcPr>
+            <w:tcW w:type="dxa" w:w="2880"/>
+          </w:tcPr>
+          <w:p>
+            <w:r>
+              <w:t>AI: 'Is maintenance mode enabled on this switch?'</w:t>
+            </w:r>
+          </w:p>
+        </w:tc>
+      </w:tr>
+      <w:tr>
+        <w:tc>
+          <w:tcPr>
+            <w:tcW w:type="dxa" w:w="2880"/>
+          </w:tcPr>
+          <w:p>
+            <w:r>
+              <w:t>restconf_get_system_maintenance_rate_monitoring</w:t>
+            </w:r>
+          </w:p>
+        </w:tc>
+        <w:tc>
+          <w:tcPr>
+            <w:tcW w:type="dxa" w:w="2880"/>
+          </w:tcPr>
+          <w:p>
+            <w:r>
+              <w:t>Retrieve maintenance rate monitoring configuration/status (may return 204 if disabled).</w:t>
+            </w:r>
+          </w:p>
+        </w:tc>
+        <w:tc>
+          <w:tcPr>
+            <w:tcW w:type="dxa" w:w="2880"/>
+          </w:tcPr>
+          <w:p>
+            <w:r>
+              <w:t>AI: 'Check if maintenance rate monitoring is configured.'</w:t>
+            </w:r>
+          </w:p>
+        </w:tc>
+      </w:tr>
+    </w:tbl>
     <w:sectPr>
       <w:pgSz w:w="12240" w:h="15840"/>
       <w:pgMar w:top="1440" w:right="1800" w:bottom="1440" w:left="1800" w:header="720" w:footer="720" w:gutter="0"/>

</xml_diff>

<commit_message>
docs: add DEPLOY.md + refresh User Guide and Operator Notes
- DEPLOY.md (new): Docker-centric community deployment guide — load image,
  env config, run/compose, verify, /mcp transport, reverse-proxy/TLS,
  monitoring, rate limiting, logs, upgrade, troubleshooting.
- User Guide (.docx): refresh date; add sections for the MCP /mcp transport,
  X-Catalog-Version, discovery tools, and ARP multi-switch fan-out; add a
  `docker logs` line to troubleshooting.
- Operator Notes (.docx): Tier-2 count 37 -> 45 + updated date; add a
  "What's New (2026-06)" section (MCP transport, catalog version, discovery
  tools, ARP fan-out, RESTCONF JSON bodies, LLDP fields, 429/Retry-After).

Co-Authored-By: Claude Opus 4.8 <noreply@anthropic.com>
</commit_message>
<xml_diff>
--- a/XCO_MCP_Server_User_Guide.docx
+++ b/XCO_MCP_Server_User_Guide.docx
@@ -12,12 +12,6 @@
           <w:sz w:val="48"/>
         </w:rPr>
         <w:t>XCO MCP Server</w:t>
-      </w:r>
-      <w:r>
-        <w:rPr>
-          <w:b/>
-          <w:sz w:val="48"/>
-        </w:rPr>
         <w:br/>
         <w:t>User Guide</w:t>
       </w:r>
@@ -39,7 +33,7 @@
         <w:jc w:val="center"/>
       </w:pPr>
       <w:r>
-        <w:t>Generated: 2026-02-11</w:t>
+        <w:t>Generated: 2026-06-26</w:t>
       </w:r>
     </w:p>
     <w:p>
@@ -493,28 +487,10 @@
           <w:sz w:val="20"/>
         </w:rPr>
         <w:t>{</w:t>
-      </w:r>
-      <w:r>
-        <w:rPr>
-          <w:rFonts w:ascii="Consolas" w:hAnsi="Consolas"/>
-          <w:sz w:val="20"/>
-        </w:rPr>
         <w:br/>
         <w:t xml:space="preserve">  "tool": "&lt;tool_name&gt;",</w:t>
-      </w:r>
-      <w:r>
-        <w:rPr>
-          <w:rFonts w:ascii="Consolas" w:hAnsi="Consolas"/>
-          <w:sz w:val="20"/>
-        </w:rPr>
         <w:br/>
         <w:t xml:space="preserve">  "inputs": { /* tool-specific inputs */ }</w:t>
-      </w:r>
-      <w:r>
-        <w:rPr>
-          <w:rFonts w:ascii="Consolas" w:hAnsi="Consolas"/>
-          <w:sz w:val="20"/>
-        </w:rPr>
         <w:br/>
         <w:t>}</w:t>
       </w:r>
@@ -559,12 +535,6 @@
           <w:sz w:val="20"/>
         </w:rPr>
         <w:t>curl -sS -X POST "$MCP" -H "Content-Type: application/json" \</w:t>
-      </w:r>
-      <w:r>
-        <w:rPr>
-          <w:rFonts w:ascii="Consolas" w:hAnsi="Consolas"/>
-          <w:sz w:val="20"/>
-        </w:rPr>
         <w:br/>
         <w:t xml:space="preserve">  -d '{"tool":"system_get_health_status","inputs":{}}' | jq</w:t>
       </w:r>
@@ -584,28 +554,10 @@
           <w:sz w:val="20"/>
         </w:rPr>
         <w:t>curl -sS -X POST "$MCP" -H "Content-Type: application/json" \</w:t>
-      </w:r>
-      <w:r>
-        <w:rPr>
-          <w:rFonts w:ascii="Consolas" w:hAnsi="Consolas"/>
-          <w:sz w:val="20"/>
-        </w:rPr>
         <w:br/>
         <w:t xml:space="preserve">  -d '{"tool":"system_get_certificate_alarm_context","inputs":{"severity_min":"Majo</w:t>
-      </w:r>
-      <w:r>
-        <w:rPr>
-          <w:rFonts w:ascii="Consolas" w:hAnsi="Consolas"/>
-          <w:sz w:val="20"/>
-        </w:rPr>
         <w:lastRenderedPageBreak/>
         <w:t>r"}}' \</w:t>
-      </w:r>
-      <w:r>
-        <w:rPr>
-          <w:rFonts w:ascii="Consolas" w:hAnsi="Consolas"/>
-          <w:sz w:val="20"/>
-        </w:rPr>
         <w:br/>
         <w:t>| jq</w:t>
       </w:r>
@@ -704,20 +656,8 @@
           <w:sz w:val="20"/>
         </w:rPr>
         <w:t>curl -sS -X POST "$MCP" -H "Content-Type: application/json" \</w:t>
-      </w:r>
-      <w:r>
-        <w:rPr>
-          <w:rFonts w:ascii="Consolas" w:hAnsi="Consolas"/>
-          <w:sz w:val="20"/>
-        </w:rPr>
         <w:br/>
         <w:t xml:space="preserve">  -d '{"tool":"system_get_certificate_alarm_context","inputs":{"include_raw":true}}' \</w:t>
-      </w:r>
-      <w:r>
-        <w:rPr>
-          <w:rFonts w:ascii="Consolas" w:hAnsi="Consolas"/>
-          <w:sz w:val="20"/>
-        </w:rPr>
         <w:br/>
         <w:t>| jq '.result.payload.tier1_raw | keys'</w:t>
       </w:r>
@@ -753,20 +693,8 @@
           <w:sz w:val="20"/>
         </w:rPr>
         <w:t>curl -sS -X POST "$MCP" -H "Content-Type: application/json" \</w:t>
-      </w:r>
-      <w:r>
-        <w:rPr>
-          <w:rFonts w:ascii="Consolas" w:hAnsi="Consolas"/>
-          <w:sz w:val="20"/>
-        </w:rPr>
         <w:br/>
         <w:t xml:space="preserve">  -d '{"tool":"system_get_certificate_alarm_context","inputs":{}}' \</w:t>
-      </w:r>
-      <w:r>
-        <w:rPr>
-          <w:rFonts w:ascii="Consolas" w:hAnsi="Consolas"/>
-          <w:sz w:val="20"/>
-        </w:rPr>
         <w:br/>
         <w:t>| jq '.result.payload.summary'</w:t>
       </w:r>
@@ -786,28 +714,10 @@
           <w:sz w:val="20"/>
         </w:rPr>
         <w:t>curl -sS -X POST "$MCP" -H "Content-Type: application/json" \</w:t>
-      </w:r>
-      <w:r>
-        <w:rPr>
-          <w:rFonts w:ascii="Consolas" w:hAnsi="Consolas"/>
-          <w:sz w:val="20"/>
-        </w:rPr>
         <w:br/>
         <w:t xml:space="preserve">  -d </w:t>
-      </w:r>
-      <w:r>
-        <w:rPr>
-          <w:rFonts w:ascii="Consolas" w:hAnsi="Consolas"/>
-          <w:sz w:val="20"/>
-        </w:rPr>
         <w:lastRenderedPageBreak/>
         <w:t>'{"tool":"system_get_certificate_alarm_context","inputs":{"severity_min":"Major","require_expiry_terms":false,"max_alarms":50}}' \</w:t>
-      </w:r>
-      <w:r>
-        <w:rPr>
-          <w:rFonts w:ascii="Consolas" w:hAnsi="Consolas"/>
-          <w:sz w:val="20"/>
-        </w:rPr>
         <w:br/>
         <w:t>| jq '.result.payload.alarms[0:3]'</w:t>
       </w:r>
@@ -835,20 +745,8 @@
           <w:sz w:val="20"/>
         </w:rPr>
         <w:t>curl -sS -X POST "$MCP" -H "Content-Type: application/json" \</w:t>
-      </w:r>
-      <w:r>
-        <w:rPr>
-          <w:rFonts w:ascii="Consolas" w:hAnsi="Consolas"/>
-          <w:sz w:val="20"/>
-        </w:rPr>
         <w:br/>
         <w:t xml:space="preserve">  -d '{"tool":"system_get_certificates_expiring_soon","inputs":{"window_days":90}}' \</w:t>
-      </w:r>
-      <w:r>
-        <w:rPr>
-          <w:rFonts w:ascii="Consolas" w:hAnsi="Consolas"/>
-          <w:sz w:val="20"/>
-        </w:rPr>
         <w:br/>
         <w:t>| jq '.result.payload.summary'</w:t>
       </w:r>
@@ -948,20 +846,10 @@
           <w:sz w:val="20"/>
         </w:rPr>
         <w:t>sudo systemctl status xco-mcp.service</w:t>
-      </w:r>
-      <w:r>
-        <w:rPr>
-          <w:rFonts w:ascii="Consolas" w:hAnsi="Consolas"/>
-          <w:sz w:val="20"/>
-        </w:rPr>
         <w:br/>
         <w:t>sudo journalctl -u xco-mcp.service -n 200 --no-pager</w:t>
-      </w:r>
-      <w:r>
-        <w:rPr>
-          <w:rFonts w:ascii="Consolas" w:hAnsi="Consolas"/>
-          <w:sz w:val="20"/>
-        </w:rPr>
+        <w:br/>
+        <w:t xml:space="preserve">docker logs --tail 200 xco-mcp   # if running as a Docker container</w:t>
         <w:br/>
         <w:t>curl -sS http://&lt;your_mcp_IP_addr&gt;:8000/metrics | head</w:t>
       </w:r>
@@ -1027,30 +915,93 @@
           <w:sz w:val="20"/>
         </w:rPr>
         <w:t>python3 scripts/generate_tool_docs.py \</w:t>
-      </w:r>
-      <w:r>
-        <w:rPr>
-          <w:rFonts w:ascii="Consolas" w:hAnsi="Consolas"/>
-          <w:sz w:val="20"/>
-        </w:rPr>
         <w:br/>
         <w:t xml:space="preserve">  --tools generated/mcp_tools.json \</w:t>
-      </w:r>
-      <w:r>
-        <w:rPr>
-          <w:rFonts w:ascii="Consolas" w:hAnsi="Consolas"/>
-          <w:sz w:val="20"/>
-        </w:rPr>
         <w:br/>
         <w:t xml:space="preserve">  --out-md docs/TOOL_CATALOG.md \</w:t>
-      </w:r>
-      <w:r>
-        <w:rPr>
-          <w:rFonts w:ascii="Consolas" w:hAnsi="Consolas"/>
-          <w:sz w:val="20"/>
-        </w:rPr>
         <w:br/>
         <w:t xml:space="preserve">  --out-openapi openapi/mcp-server/openapi_mcp_invoke.yaml</w:t>
+      </w:r>
+    </w:p>
+    <w:p>
+      <w:pPr>
+        <w:pStyle w:val="Heading1"/>
+      </w:pPr>
+      <w:r>
+        <w:t>9. MCP Protocol Transport (/mcp)</w:t>
+      </w:r>
+    </w:p>
+    <w:p>
+      <w:r>
+        <w:t>Standard MCP clients (MCP Inspector, Claude Desktop, and any JSON-RPC 2.0 MCP client) connect directly to the Streamable-HTTP endpoint at POST /mcp, alongside the REST POST /invoke front door. Both route through the same tool registry, so the two front doors never diverge.</w:t>
+      </w:r>
+    </w:p>
+    <w:p>
+      <w:r>
+        <w:t>The standard MCP handshake applies: initialize, then tools/list, then tools/call. The transport is enabled by default; set MCP_TRANSPORT_ENABLED=false to disable it. It serves the same tool set as GET /tools.</w:t>
+      </w:r>
+    </w:p>
+    <w:p>
+      <w:pPr>
+        <w:pStyle w:val="Heading2"/>
+      </w:pPr>
+      <w:r>
+        <w:t>9.1 Catalog version</w:t>
+      </w:r>
+    </w:p>
+    <w:p>
+      <w:r>
+        <w:t>GET /tools returns an X-Catalog-Version response header, and the MCP initialize handshake advertises the same catalog_version capability. It is a stable hash of the tool surface (names, input schemas, risk). Cache it; when it is unchanged, the catalog has not changed and a client may reuse its cached tool list instead of re-discovering.</w:t>
+      </w:r>
+    </w:p>
+    <w:p>
+      <w:pPr>
+        <w:pStyle w:val="Heading1"/>
+      </w:pPr>
+      <w:r>
+        <w:t>10. Discovery (paired-ID) tools</w:t>
+      </w:r>
+    </w:p>
+    <w:p>
+      <w:r>
+        <w:t>Several tools require an identifier (device_id, tenant, fabric_name). Paired SAFE_READ discovery tools return those IDs in clean snake_case so a client never has to hard-code a value from a cached sample:</w:t>
+      </w:r>
+    </w:p>
+    <w:p>
+      <w:pPr>
+        <w:pStyle w:val="ListBullet"/>
+      </w:pPr>
+      <w:r>
+        <w:t>inventory_list_device_ids — device_ids[] plus devices[{device_id, ip, hostname}].</w:t>
+      </w:r>
+    </w:p>
+    <w:p>
+      <w:pPr>
+        <w:pStyle w:val="ListBullet"/>
+      </w:pPr>
+      <w:r>
+        <w:t>tenant_list_ids — tenant_ids[] plus tenants[{tenant_id, tenant_name}].</w:t>
+      </w:r>
+    </w:p>
+    <w:p>
+      <w:pPr>
+        <w:pStyle w:val="ListBullet"/>
+      </w:pPr>
+      <w:r>
+        <w:t>fabric_get_fabric_names — fabric_names[] plus fabrics[{fabric_name, fabric_id, fabric_type}].</w:t>
+      </w:r>
+    </w:p>
+    <w:p>
+      <w:pPr>
+        <w:pStyle w:val="Heading1"/>
+      </w:pPr>
+      <w:r>
+        <w:t>11. Multi-switch ARP fan-out</w:t>
+      </w:r>
+    </w:p>
+    <w:p>
+      <w:r>
+        <w:t>restconf_get_arp_table accepts switch_ip as a single string (single-switch, original response shape) or a list of strings (parallel multi-switch fan-out). With a list it returns meta.multi_switch=true plus switch_level_data_by_ip and errors_by_ip; a failure on one switch is non-fatal and is reported per-IP.</w:t>
       </w:r>
     </w:p>
     <w:p>
@@ -1076,20 +1027,8 @@
           <w:sz w:val="20"/>
         </w:rPr>
         <w:t>curl -sS -X POST "$MCP" -H "Content-Type: application/json" \</w:t>
-      </w:r>
-      <w:r>
-        <w:rPr>
-          <w:rFonts w:ascii="Consolas" w:hAnsi="Consolas"/>
-          <w:sz w:val="20"/>
-        </w:rPr>
         <w:br/>
         <w:t xml:space="preserve">  -d '{"tool":"&lt;tool_name&gt;","inputs":{}}' \</w:t>
-      </w:r>
-      <w:r>
-        <w:rPr>
-          <w:rFonts w:ascii="Consolas" w:hAnsi="Consolas"/>
-          <w:sz w:val="20"/>
-        </w:rPr>
         <w:br/>
         <w:t>| jq '.result.payload | {summary, warnings}'</w:t>
       </w:r>
@@ -1109,20 +1048,8 @@
           <w:sz w:val="20"/>
         </w:rPr>
         <w:t>curl -sS -X POST "$MCP" -H "Content-Type: application/json" \</w:t>
-      </w:r>
-      <w:r>
-        <w:rPr>
-          <w:rFonts w:ascii="Consolas" w:hAnsi="Consolas"/>
-          <w:sz w:val="20"/>
-        </w:rPr>
         <w:br/>
         <w:t xml:space="preserve">  -d '{"tool":"&lt;tool_name&gt;","inputs":{"include_raw":true}}' \</w:t>
-      </w:r>
-      <w:r>
-        <w:rPr>
-          <w:rFonts w:ascii="Consolas" w:hAnsi="Consolas"/>
-          <w:sz w:val="20"/>
-        </w:rPr>
         <w:br/>
         <w:t>| jq '.result.payload.tier1_raw | keys'</w:t>
       </w:r>
@@ -1142,10 +1069,7 @@
     </w:p>
     <w:p>
       <w:r>
-        <w:t xml:space="preserve">This section documents the RESTCONF-focused Tier‑2 tools added for SLX switches. </w:t>
-      </w:r>
-      <w:r>
-        <w:t>All tools are SAFE_READ and require a target switch management IP/FQDN via the `switch_ip` input.</w:t>
+        <w:t>This section documents the RESTCONF-focused Tier‑2 tools added for SLX switches. All tools are SAFE_READ and require a target switch management IP/FQDN via the `switch_ip` input.</w:t>
       </w:r>
     </w:p>
     <w:p>

</xml_diff>

<commit_message>
docs: point User Guide §8.1 at the real catalog generator
The guide showed a hypothetical `scripts/generate_tool_docs.py` with an
invented CLI. Update it to the committed `python3 scripts/gen_tool_catalog.py`
(no args) and note that the server serves docs/TOOL_CATALOG.md as-is.

Co-Authored-By: Claude Opus 4.8 <noreply@anthropic.com>
</commit_message>
<xml_diff>
--- a/XCO_MCP_Server_User_Guide.docx
+++ b/XCO_MCP_Server_User_Guide.docx
@@ -902,7 +902,7 @@
     </w:p>
     <w:p>
       <w:r>
-        <w:t>If you keep a generator script (recommended), document the command here. Example:</w:t>
+        <w:t>The server serves docs/TOOL_CATALOG.md as-is (GET /docs/tools); it does not regenerate it. After any tool change, rebuild it from the catalog with the committed generator:</w:t>
       </w:r>
     </w:p>
     <w:p>
@@ -914,13 +914,7 @@
           <w:rFonts w:ascii="Consolas" w:hAnsi="Consolas"/>
           <w:sz w:val="20"/>
         </w:rPr>
-        <w:t>python3 scripts/generate_tool_docs.py \</w:t>
-        <w:br/>
-        <w:t xml:space="preserve">  --tools generated/mcp_tools.json \</w:t>
-        <w:br/>
-        <w:t xml:space="preserve">  --out-md docs/TOOL_CATALOG.md \</w:t>
-        <w:br/>
-        <w:t xml:space="preserve">  --out-openapi openapi/mcp-server/openapi_mcp_invoke.yaml</w:t>
+        <w:t>python3 scripts/gen_tool_catalog.py</w:t>
       </w:r>
     </w:p>
     <w:p>

</xml_diff>